<commit_message>
feat(exhibits): standardize verified 5-exhibit list & enforce international thesis font standards across all documents
</commit_message>
<xml_diff>
--- a/downloads/臺中市公寓大廈爭議事件調處申請書.docx
+++ b/downloads/臺中市公寓大廈爭議事件調處申請書.docx
@@ -2,21 +2,6 @@
 <file path=word/document.xml><?xml version="1.0" encoding="utf-8"?>
 <w:document xmlns:wpc="http://schemas.microsoft.com/office/word/2010/wordprocessingCanvas" xmlns:mo="http://schemas.microsoft.com/office/mac/office/2008/main" xmlns:mc="http://schemas.openxmlformats.org/markup-compatibility/2006" xmlns:mv="urn:schemas-microsoft-com:mac:vml" xmlns:o="urn:schemas-microsoft-com:office:office" xmlns:r="http://schemas.openxmlformats.org/officeDocument/2006/relationships" xmlns:m="http://schemas.openxmlformats.org/officeDocument/2006/math" xmlns:v="urn:schemas-microsoft-com:vml" xmlns:wp14="http://schemas.microsoft.com/office/word/2010/wordprocessingDrawing" xmlns:wp="http://schemas.openxmlformats.org/drawingml/2006/wordprocessingDrawing" xmlns:w10="urn:schemas-microsoft-com:office:word" xmlns:w="http://schemas.openxmlformats.org/wordprocessingml/2006/main" xmlns:w14="http://schemas.microsoft.com/office/word/2010/wordml" xmlns:wpg="http://schemas.microsoft.com/office/word/2010/wordprocessingGroup" xmlns:wpi="http://schemas.microsoft.com/office/word/2010/wordprocessingInk" xmlns:wne="http://schemas.microsoft.com/office/word/2006/wordml" xmlns:wps="http://schemas.microsoft.com/office/word/2010/wordprocessingShape" mc:Ignorable="w14 wp14">
   <w:body>
-    <w:p>
-      <w:pPr>
-        <w:spacing w:before="0" w:after="40" w:line="276" w:lineRule="auto"/>
-        <w:jc w:val="center"/>
-      </w:pPr>
-      <w:r>
-        <w:rPr>
-          <w:rFonts w:ascii="PingFang TC" w:hAnsi="PingFang TC"/>
-          <w:b/>
-          <w:color w:val="B8860B"/>
-          <w:sz w:val="28"/>
-        </w:rPr>
-        <w:t>臺中市公寓大廈爭議事件調處申請書</w:t>
-      </w:r>
-    </w:p>
     <w:p>
       <w:pPr>
         <w:spacing w:before="0" w:after="80"/>
@@ -25,8 +10,23 @@
       <w:r>
         <w:rPr>
           <w:rFonts w:ascii="PingFang TC" w:hAnsi="PingFang TC"/>
-          <w:color w:val="8C8273"/>
-          <w:sz w:val="16"/>
+          <w:b/>
+          <w:color w:val="B8860B"/>
+          <w:sz w:val="36"/>
+        </w:rPr>
+        <w:t>臺中市公寓大廈爭議事件調處申請書</w:t>
+      </w:r>
+    </w:p>
+    <w:p>
+      <w:pPr>
+        <w:spacing w:after="160"/>
+        <w:jc w:val="center"/>
+      </w:pPr>
+      <w:r>
+        <w:rPr>
+          <w:rFonts w:ascii="PingFang TC" w:hAnsi="PingFang TC"/>
+          <w:color w:val="787369"/>
+          <w:sz w:val="20"/>
         </w:rPr>
         <w:t>依據《公寓大廈管理條例》第 59 條之 1、第 53 條規定申請管理組織分流與資產移交調處</w:t>
       </w:r>
@@ -38,31 +38,28 @@
         <w:tblLook w:firstColumn="1" w:firstRow="1" w:lastColumn="0" w:lastRow="0" w:noHBand="0" w:noVBand="1" w:val="04A0"/>
       </w:tblPr>
       <w:tblGrid>
-        <w:gridCol w:w="4933"/>
-        <w:gridCol w:w="4933"/>
+        <w:gridCol w:w="4759"/>
+        <w:gridCol w:w="4759"/>
       </w:tblGrid>
       <w:tr>
         <w:tc>
           <w:tcPr>
-            <w:tcW w:type="dxa" w:w="1587"/>
+            <w:tcW w:type="dxa" w:w="1814"/>
             <w:shd w:fill="FFFDF5"/>
             <w:tcMar>
-              <w:top w:w="30" w:type="dxa"/>
-              <w:bottom w:w="30" w:type="dxa"/>
+              <w:top w:w="40" w:type="dxa"/>
+              <w:bottom w:w="40" w:type="dxa"/>
               <w:left w:w="60" w:type="dxa"/>
               <w:right w:w="60" w:type="dxa"/>
             </w:tcMar>
           </w:tcPr>
           <w:p>
-            <w:pPr>
-              <w:spacing w:after="0"/>
-            </w:pPr>
             <w:r>
               <w:rPr>
                 <w:rFonts w:ascii="PingFang TC" w:hAnsi="PingFang TC"/>
                 <w:b/>
                 <w:color w:val="B8860B"/>
-                <w:sz w:val="16"/>
+                <w:sz w:val="21"/>
               </w:rPr>
               <w:t>申  請  人</w:t>
             </w:r>
@@ -70,24 +67,21 @@
         </w:tc>
         <w:tc>
           <w:tcPr>
-            <w:tcW w:type="dxa" w:w="8277"/>
+            <w:tcW w:type="dxa" w:w="7370"/>
             <w:shd w:fill="FFFFFF"/>
             <w:tcMar>
-              <w:top w:w="30" w:type="dxa"/>
-              <w:bottom w:w="30" w:type="dxa"/>
+              <w:top w:w="40" w:type="dxa"/>
+              <w:bottom w:w="40" w:type="dxa"/>
               <w:left w:w="60" w:type="dxa"/>
               <w:right w:w="60" w:type="dxa"/>
             </w:tcMar>
           </w:tcPr>
           <w:p>
-            <w:pPr>
-              <w:spacing w:after="0"/>
-            </w:pPr>
             <w:r>
               <w:rPr>
                 <w:rFonts w:ascii="PingFang TC" w:hAnsi="PingFang TC"/>
-                <w:color w:val="1A1D20"/>
-                <w:sz w:val="16"/>
+                <w:color w:val="22252A"/>
+                <w:sz w:val="21"/>
               </w:rPr>
               <w:t>富宇大境（A2 區）全體 6 戶區分所有權人（沙鹿區龍社路 593～603 號全體區權人，名冊詳第二頁）</w:t>
             </w:r>
@@ -97,53 +91,47 @@
       <w:tr>
         <w:tc>
           <w:tcPr>
-            <w:tcW w:type="dxa" w:w="1587"/>
+            <w:tcW w:type="dxa" w:w="1814"/>
             <w:shd w:fill="FFFDF5"/>
             <w:tcMar>
-              <w:top w:w="30" w:type="dxa"/>
-              <w:bottom w:w="30" w:type="dxa"/>
+              <w:top w:w="40" w:type="dxa"/>
+              <w:bottom w:w="40" w:type="dxa"/>
               <w:left w:w="60" w:type="dxa"/>
               <w:right w:w="60" w:type="dxa"/>
             </w:tcMar>
           </w:tcPr>
           <w:p>
-            <w:pPr>
-              <w:spacing w:after="0"/>
-            </w:pPr>
             <w:r>
               <w:rPr>
                 <w:rFonts w:ascii="PingFang TC" w:hAnsi="PingFang TC"/>
                 <w:b/>
                 <w:color w:val="B8860B"/>
-                <w:sz w:val="16"/>
+                <w:sz w:val="21"/>
               </w:rPr>
-              <w:t>申請人代理人</w:t>
+              <w:t>特別代理人</w:t>
             </w:r>
           </w:p>
         </w:tc>
         <w:tc>
           <w:tcPr>
-            <w:tcW w:type="dxa" w:w="8277"/>
+            <w:tcW w:type="dxa" w:w="7370"/>
             <w:shd w:fill="FAF8F2"/>
             <w:tcMar>
-              <w:top w:w="30" w:type="dxa"/>
-              <w:bottom w:w="30" w:type="dxa"/>
+              <w:top w:w="40" w:type="dxa"/>
+              <w:bottom w:w="40" w:type="dxa"/>
               <w:left w:w="60" w:type="dxa"/>
               <w:right w:w="60" w:type="dxa"/>
             </w:tcMar>
           </w:tcPr>
           <w:p>
-            <w:pPr>
-              <w:spacing w:after="0"/>
-            </w:pPr>
             <w:r>
               <w:rPr>
                 <w:rFonts w:ascii="PingFang TC" w:hAnsi="PingFang TC"/>
                 <w:b/>
-                <w:color w:val="1A1D20"/>
-                <w:sz w:val="16"/>
+                <w:color w:val="22252A"/>
+                <w:sz w:val="21"/>
               </w:rPr>
-              <w:t>廖倫豪（特別代理人，住址：台中市沙鹿區龍社路 595 號，獲民法第 534 條調處和解特別授權）</w:t>
+              <w:t>廖倫豪 博士（住址：台中市沙鹿區龍社路 595 號，獲民法第 534 條調處和解特別授權）</w:t>
             </w:r>
           </w:p>
         </w:tc>
@@ -151,25 +139,22 @@
       <w:tr>
         <w:tc>
           <w:tcPr>
-            <w:tcW w:type="dxa" w:w="1587"/>
+            <w:tcW w:type="dxa" w:w="1814"/>
             <w:shd w:fill="FFFDF5"/>
             <w:tcMar>
-              <w:top w:w="30" w:type="dxa"/>
-              <w:bottom w:w="30" w:type="dxa"/>
+              <w:top w:w="40" w:type="dxa"/>
+              <w:bottom w:w="40" w:type="dxa"/>
               <w:left w:w="60" w:type="dxa"/>
               <w:right w:w="60" w:type="dxa"/>
             </w:tcMar>
           </w:tcPr>
           <w:p>
-            <w:pPr>
-              <w:spacing w:after="0"/>
-            </w:pPr>
             <w:r>
               <w:rPr>
                 <w:rFonts w:ascii="PingFang TC" w:hAnsi="PingFang TC"/>
                 <w:b/>
                 <w:color w:val="B8860B"/>
-                <w:sz w:val="16"/>
+                <w:sz w:val="21"/>
               </w:rPr>
               <w:t>相  對  人</w:t>
             </w:r>
@@ -177,1048 +162,24 @@
         </w:tc>
         <w:tc>
           <w:tcPr>
-            <w:tcW w:type="dxa" w:w="8277"/>
+            <w:tcW w:type="dxa" w:w="7370"/>
             <w:shd w:fill="FFFFFF"/>
             <w:tcMar>
-              <w:top w:w="30" w:type="dxa"/>
-              <w:bottom w:w="30" w:type="dxa"/>
+              <w:top w:w="40" w:type="dxa"/>
+              <w:bottom w:w="40" w:type="dxa"/>
               <w:left w:w="60" w:type="dxa"/>
               <w:right w:w="60" w:type="dxa"/>
             </w:tcMar>
           </w:tcPr>
           <w:p>
-            <w:pPr>
-              <w:spacing w:after="0"/>
-            </w:pPr>
             <w:r>
               <w:rPr>
                 <w:rFonts w:ascii="PingFang TC" w:hAnsi="PingFang TC"/>
-                <w:color w:val="1A1D20"/>
-                <w:sz w:val="16"/>
+                <w:color w:val="22252A"/>
+                <w:sz w:val="21"/>
               </w:rPr>
               <w:t>富宇大地社區管理委員會（法定代理人：主任委員，會址：台中市沙鹿區龍社路 642 巷口管理室）</w:t>
             </w:r>
-          </w:p>
-        </w:tc>
-      </w:tr>
-    </w:tbl>
-    <w:tbl>
-      <w:tblPr>
-        <w:tblW w:type="auto" w:w="0"/>
-        <w:jc w:val="center"/>
-        <w:tblLook w:firstColumn="1" w:firstRow="1" w:lastColumn="0" w:lastRow="0" w:noHBand="0" w:noVBand="1" w:val="04A0"/>
-      </w:tblPr>
-      <w:tblGrid>
-        <w:gridCol w:w="9866"/>
-      </w:tblGrid>
-      <w:tr>
-        <w:tc>
-          <w:tcPr>
-            <w:tcW w:type="dxa" w:w="9865"/>
-            <w:shd w:fill="FFFDF5"/>
-            <w:tcMar>
-              <w:top w:w="40" w:type="dxa"/>
-              <w:bottom w:w="40" w:type="dxa"/>
-              <w:left w:w="80" w:type="dxa"/>
-              <w:right w:w="70" w:type="dxa"/>
-            </w:tcMar>
-            <w:tcBorders>
-              <w:left w:val="single" w:sz="24" w:space="0" w:color="D4AF37"/>
-              <w:top w:val="none"/>
-              <w:right w:val="none"/>
-              <w:bottom w:val="none"/>
-            </w:tcBorders>
-          </w:tcPr>
-          <w:p>
-            <w:pPr>
-              <w:spacing w:line="276" w:lineRule="auto" w:after="0"/>
-            </w:pPr>
-            <w:r>
-              <w:rPr>
-                <w:rFonts w:ascii="PingFang TC" w:hAnsi="PingFang TC"/>
-                <w:b/>
-                <w:color w:val="B8860B"/>
-                <w:sz w:val="17"/>
-              </w:rPr>
-              <w:t>【請求調處事項】</w:t>
-              <w:br/>
-            </w:r>
-            <w:r>
-              <w:rPr>
-                <w:rFonts w:ascii="PingFang TC" w:hAnsi="PingFang TC"/>
-                <w:color w:val="1A1D20"/>
-                <w:sz w:val="16"/>
-              </w:rPr>
-              <w:t>一、請求調處確認申請人 6 戶建物依《公寓大廈管理條例》第 53 條自相對人「富宇大地」管理組織範圍合意分流退出，回歸一般自用獨立透天住宅生活，不另成立管理委員會，並由建物管轄區公所准予變更備查。</w:t>
-              <w:br/>
-              <w:t>二、請求相對人於分流核准後，將專單立卷保管之新光銀行沙鹿分行「A2 大境定存單本息（NT$ 220,231 元）」及交屋管理基金（每戶 1 萬共 NT$ 60,000 元，合計約 28.4 萬元）依戶數均分，全額撥還退交申請人 6 戶區權人（每戶退還約 NT$ 47,455 元）。</w:t>
-              <w:br/>
-              <w:t>三、請求確認自調處成立生效日起，申請人 6 戶終止繳納相對人每月管理費，相對人亦免除對申請人門前路段之巡查維護責任。</w:t>
-            </w:r>
-          </w:p>
-        </w:tc>
-      </w:tr>
-    </w:tbl>
-    <w:p>
-      <w:pPr>
-        <w:spacing w:before="60" w:after="20"/>
-      </w:pPr>
-      <w:r>
-        <w:rPr>
-          <w:rFonts w:ascii="PingFang TC" w:hAnsi="PingFang TC"/>
-          <w:b/>
-          <w:color w:val="B8860B"/>
-          <w:sz w:val="17"/>
-        </w:rPr>
-        <w:t>【事實及理由摘要】</w:t>
-      </w:r>
-    </w:p>
-    <w:p>
-      <w:pPr>
-        <w:spacing w:line="269" w:lineRule="auto" w:before="20" w:after="20"/>
-      </w:pPr>
-      <w:r>
-        <w:rPr>
-          <w:rFonts w:ascii="PingFang TC" w:hAnsi="PingFang TC"/>
-          <w:b/>
-          <w:color w:val="B8860B"/>
-          <w:sz w:val="16"/>
-        </w:rPr>
-        <w:t>一、出入與機能獨立無公設不可分性：</w:t>
-      </w:r>
-      <w:r>
-        <w:rPr>
-          <w:rFonts w:ascii="PingFang TC" w:hAnsi="PingFang TC"/>
-          <w:color w:val="1A1D20"/>
-          <w:sz w:val="16"/>
-        </w:rPr>
-        <w:t>申請人 6 戶透天座落沙鹿區龍社路 593～603 號，直接面臨公有計畫道路獨立出入，無須經由相對人內部巷道；自來水、自用電表、生活排水與化糞均獨立自理；生活廢棄物門前等候市府免費清潔隊清運，且申請人已立切結自願放棄使用相對人內部收費子母車，客觀上完全無《條例》第 53 條所稱「共用設施整體不可分性」。</w:t>
-      </w:r>
-    </w:p>
-    <w:p>
-      <w:pPr>
-        <w:spacing w:line="269" w:lineRule="auto" w:before="20" w:after="20"/>
-      </w:pPr>
-      <w:r>
-        <w:rPr>
-          <w:rFonts w:ascii="PingFang TC" w:hAnsi="PingFang TC"/>
-          <w:b/>
-          <w:color w:val="B8860B"/>
-          <w:sz w:val="16"/>
-        </w:rPr>
-        <w:t>二、定存專單獨立立卷且財務帳目清楚：</w:t>
-      </w:r>
-      <w:r>
-        <w:rPr>
-          <w:rFonts w:ascii="PingFang TC" w:hAnsi="PingFang TC"/>
-          <w:color w:val="1A1D20"/>
-          <w:sz w:val="16"/>
-        </w:rPr>
-        <w:t>相對人 115 年 5 月 6 日例會議題四決議及 9 月財報已明確將台中市政府核退之公款分別定存，其中第 2 筆即獨立立卷為「A2 大境區定存單 NT$ 220,231 元」；起造人交屋管理基金亦有每戶 1 萬元專款可稽。移交純屬原款專案歸位，相對人 235 戶之原有數百萬元公共基金分毫不受影響。</w:t>
-      </w:r>
-    </w:p>
-    <w:p>
-      <w:pPr>
-        <w:spacing w:line="269" w:lineRule="auto" w:before="20" w:after="20"/>
-      </w:pPr>
-      <w:r>
-        <w:rPr>
-          <w:rFonts w:ascii="PingFang TC" w:hAnsi="PingFang TC"/>
-          <w:b/>
-          <w:color w:val="B8860B"/>
-          <w:sz w:val="16"/>
-        </w:rPr>
-        <w:t>三、雙贏互惠並消弭大社區行政與法律負擔：</w:t>
-      </w:r>
-      <w:r>
-        <w:rPr>
-          <w:rFonts w:ascii="PingFang TC" w:hAnsi="PingFang TC"/>
-          <w:color w:val="1A1D20"/>
-          <w:sz w:val="16"/>
-        </w:rPr>
-        <w:t>分流後相對人責任聚焦於封閉式內部 235 戶，免除跨路巡檢與外側安全民事責任；內部子母車容量 100% 留給內部 235 戶使用。為免除全體 241 戶大會特別決議動員障礙，並賦予雙方主事幹部合法免責之和解基礎，特依法申請調處。</w:t>
-      </w:r>
-    </w:p>
-    <w:p>
-      <w:r>
-        <w:br w:type="page"/>
-      </w:r>
-    </w:p>
-    <w:p>
-      <w:pPr>
-        <w:spacing w:before="40" w:after="40"/>
-        <w:jc w:val="center"/>
-      </w:pPr>
-      <w:r>
-        <w:rPr>
-          <w:rFonts w:ascii="PingFang TC" w:hAnsi="PingFang TC"/>
-          <w:b/>
-          <w:color w:val="B8860B"/>
-          <w:sz w:val="26"/>
-        </w:rPr>
-        <w:t>富宇大境（A2 區・6 戶）全體區分所有權人調處申請簽章冊</w:t>
-      </w:r>
-    </w:p>
-    <w:p>
-      <w:pPr>
-        <w:spacing w:before="0" w:after="120"/>
-      </w:pPr>
-      <w:r>
-        <w:rPr>
-          <w:rFonts w:ascii="PingFang TC" w:hAnsi="PingFang TC"/>
-          <w:color w:val="1A1D20"/>
-          <w:sz w:val="16"/>
-        </w:rPr>
-        <w:t>全體申請人確認申請事項屬實，並共同特別授權 廖倫豪 全權出席臺中市政府調處會議、作成調處和解及簽署調處筆錄：</w:t>
-      </w:r>
-    </w:p>
-    <w:tbl>
-      <w:tblPr>
-        <w:tblW w:type="auto" w:w="0"/>
-        <w:jc w:val="center"/>
-        <w:tblLook w:firstColumn="1" w:firstRow="1" w:lastColumn="0" w:lastRow="0" w:noHBand="0" w:noVBand="1" w:val="04A0"/>
-      </w:tblPr>
-      <w:tblGrid>
-        <w:gridCol w:w="1644"/>
-        <w:gridCol w:w="1644"/>
-        <w:gridCol w:w="1644"/>
-        <w:gridCol w:w="1644"/>
-        <w:gridCol w:w="1644"/>
-        <w:gridCol w:w="1644"/>
-      </w:tblGrid>
-      <w:tr>
-        <w:tc>
-          <w:tcPr>
-            <w:tcW w:type="dxa" w:w="1587"/>
-            <w:shd w:fill="1A1D20"/>
-            <w:tcMar>
-              <w:top w:w="60" w:type="dxa"/>
-              <w:bottom w:w="60" w:type="dxa"/>
-              <w:left w:w="50" w:type="dxa"/>
-              <w:right w:w="50" w:type="dxa"/>
-            </w:tcMar>
-          </w:tcPr>
-          <w:p>
-            <w:pPr>
-              <w:spacing w:after="0"/>
-            </w:pPr>
-            <w:r>
-              <w:rPr>
-                <w:rFonts w:ascii="PingFang TC" w:hAnsi="PingFang TC"/>
-                <w:b/>
-                <w:color w:val="D4AF37"/>
-                <w:sz w:val="16"/>
-              </w:rPr>
-              <w:t>戶號門牌</w:t>
-            </w:r>
-          </w:p>
-        </w:tc>
-        <w:tc>
-          <w:tcPr>
-            <w:tcW w:type="dxa" w:w="1474"/>
-            <w:shd w:fill="1A1D20"/>
-            <w:tcMar>
-              <w:top w:w="60" w:type="dxa"/>
-              <w:bottom w:w="60" w:type="dxa"/>
-              <w:left w:w="50" w:type="dxa"/>
-              <w:right w:w="50" w:type="dxa"/>
-            </w:tcMar>
-          </w:tcPr>
-          <w:p>
-            <w:pPr>
-              <w:spacing w:after="0"/>
-            </w:pPr>
-            <w:r>
-              <w:rPr>
-                <w:rFonts w:ascii="PingFang TC" w:hAnsi="PingFang TC"/>
-                <w:b/>
-                <w:color w:val="D4AF37"/>
-                <w:sz w:val="16"/>
-              </w:rPr>
-              <w:t>區權人姓名</w:t>
-            </w:r>
-          </w:p>
-        </w:tc>
-        <w:tc>
-          <w:tcPr>
-            <w:tcW w:type="dxa" w:w="1587"/>
-            <w:shd w:fill="1A1D20"/>
-            <w:tcMar>
-              <w:top w:w="60" w:type="dxa"/>
-              <w:bottom w:w="60" w:type="dxa"/>
-              <w:left w:w="50" w:type="dxa"/>
-              <w:right w:w="50" w:type="dxa"/>
-            </w:tcMar>
-          </w:tcPr>
-          <w:p>
-            <w:pPr>
-              <w:spacing w:after="0"/>
-            </w:pPr>
-            <w:r>
-              <w:rPr>
-                <w:rFonts w:ascii="PingFang TC" w:hAnsi="PingFang TC"/>
-                <w:b/>
-                <w:color w:val="D4AF37"/>
-                <w:sz w:val="16"/>
-              </w:rPr>
-              <w:t>身分證字號</w:t>
-            </w:r>
-          </w:p>
-        </w:tc>
-        <w:tc>
-          <w:tcPr>
-            <w:tcW w:type="dxa" w:w="1587"/>
-            <w:shd w:fill="1A1D20"/>
-            <w:tcMar>
-              <w:top w:w="60" w:type="dxa"/>
-              <w:bottom w:w="60" w:type="dxa"/>
-              <w:left w:w="50" w:type="dxa"/>
-              <w:right w:w="50" w:type="dxa"/>
-            </w:tcMar>
-          </w:tcPr>
-          <w:p>
-            <w:pPr>
-              <w:spacing w:after="0"/>
-            </w:pPr>
-            <w:r>
-              <w:rPr>
-                <w:rFonts w:ascii="PingFang TC" w:hAnsi="PingFang TC"/>
-                <w:b/>
-                <w:color w:val="D4AF37"/>
-                <w:sz w:val="16"/>
-              </w:rPr>
-              <w:t>聯絡電話</w:t>
-            </w:r>
-          </w:p>
-        </w:tc>
-        <w:tc>
-          <w:tcPr>
-            <w:tcW w:type="dxa" w:w="1928"/>
-            <w:shd w:fill="1A1D20"/>
-            <w:tcMar>
-              <w:top w:w="60" w:type="dxa"/>
-              <w:bottom w:w="60" w:type="dxa"/>
-              <w:left w:w="50" w:type="dxa"/>
-              <w:right w:w="50" w:type="dxa"/>
-            </w:tcMar>
-          </w:tcPr>
-          <w:p>
-            <w:pPr>
-              <w:spacing w:after="0"/>
-            </w:pPr>
-            <w:r>
-              <w:rPr>
-                <w:rFonts w:ascii="PingFang TC" w:hAnsi="PingFang TC"/>
-                <w:b/>
-                <w:color w:val="D4AF37"/>
-                <w:sz w:val="16"/>
-              </w:rPr>
-              <w:t>親筆簽名</w:t>
-            </w:r>
-          </w:p>
-        </w:tc>
-        <w:tc>
-          <w:tcPr>
-            <w:tcW w:type="dxa" w:w="1701"/>
-            <w:shd w:fill="1A1D20"/>
-            <w:tcMar>
-              <w:top w:w="60" w:type="dxa"/>
-              <w:bottom w:w="60" w:type="dxa"/>
-              <w:left w:w="50" w:type="dxa"/>
-              <w:right w:w="50" w:type="dxa"/>
-            </w:tcMar>
-          </w:tcPr>
-          <w:p>
-            <w:pPr>
-              <w:spacing w:after="0"/>
-            </w:pPr>
-            <w:r>
-              <w:rPr>
-                <w:rFonts w:ascii="PingFang TC" w:hAnsi="PingFang TC"/>
-                <w:b/>
-                <w:color w:val="D4AF37"/>
-                <w:sz w:val="16"/>
-              </w:rPr>
-              <w:t>印鑑蓋章 / 日期</w:t>
-            </w:r>
-          </w:p>
-        </w:tc>
-      </w:tr>
-      <w:tr>
-        <w:tc>
-          <w:tcPr>
-            <w:tcW w:type="dxa" w:w="1587"/>
-            <w:shd w:fill="FFFDF5"/>
-            <w:tcMar>
-              <w:top w:w="100" w:type="dxa"/>
-              <w:bottom w:w="100" w:type="dxa"/>
-              <w:left w:w="50" w:type="dxa"/>
-              <w:right w:w="50" w:type="dxa"/>
-            </w:tcMar>
-          </w:tcPr>
-          <w:p>
-            <w:pPr>
-              <w:spacing w:after="0"/>
-            </w:pPr>
-            <w:r>
-              <w:rPr>
-                <w:rFonts w:ascii="PingFang TC" w:hAnsi="PingFang TC"/>
-                <w:b/>
-                <w:color w:val="B8860B"/>
-                <w:sz w:val="16"/>
-              </w:rPr>
-              <w:t>龍社路 593 號</w:t>
-            </w:r>
-          </w:p>
-        </w:tc>
-        <w:tc>
-          <w:tcPr>
-            <w:tcW w:type="dxa" w:w="1474"/>
-            <w:shd w:fill="FFFFFF"/>
-            <w:tcMar>
-              <w:top w:w="100" w:type="dxa"/>
-              <w:bottom w:w="100" w:type="dxa"/>
-              <w:left w:w="50" w:type="dxa"/>
-              <w:right w:w="50" w:type="dxa"/>
-            </w:tcMar>
-          </w:tcPr>
-          <w:p>
-            <w:pPr>
-              <w:spacing w:after="0"/>
-            </w:pPr>
-          </w:p>
-        </w:tc>
-        <w:tc>
-          <w:tcPr>
-            <w:tcW w:type="dxa" w:w="1587"/>
-            <w:shd w:fill="FFFFFF"/>
-            <w:tcMar>
-              <w:top w:w="100" w:type="dxa"/>
-              <w:bottom w:w="100" w:type="dxa"/>
-              <w:left w:w="50" w:type="dxa"/>
-              <w:right w:w="50" w:type="dxa"/>
-            </w:tcMar>
-          </w:tcPr>
-          <w:p>
-            <w:pPr>
-              <w:spacing w:after="0"/>
-            </w:pPr>
-          </w:p>
-        </w:tc>
-        <w:tc>
-          <w:tcPr>
-            <w:tcW w:type="dxa" w:w="1587"/>
-            <w:shd w:fill="FFFFFF"/>
-            <w:tcMar>
-              <w:top w:w="100" w:type="dxa"/>
-              <w:bottom w:w="100" w:type="dxa"/>
-              <w:left w:w="50" w:type="dxa"/>
-              <w:right w:w="50" w:type="dxa"/>
-            </w:tcMar>
-          </w:tcPr>
-          <w:p>
-            <w:pPr>
-              <w:spacing w:after="0"/>
-            </w:pPr>
-          </w:p>
-        </w:tc>
-        <w:tc>
-          <w:tcPr>
-            <w:tcW w:type="dxa" w:w="1928"/>
-            <w:shd w:fill="FFFFFF"/>
-            <w:tcMar>
-              <w:top w:w="100" w:type="dxa"/>
-              <w:bottom w:w="100" w:type="dxa"/>
-              <w:left w:w="50" w:type="dxa"/>
-              <w:right w:w="50" w:type="dxa"/>
-            </w:tcMar>
-          </w:tcPr>
-          <w:p>
-            <w:pPr>
-              <w:spacing w:after="0"/>
-            </w:pPr>
-          </w:p>
-        </w:tc>
-        <w:tc>
-          <w:tcPr>
-            <w:tcW w:type="dxa" w:w="1701"/>
-            <w:shd w:fill="FFFFFF"/>
-            <w:tcMar>
-              <w:top w:w="100" w:type="dxa"/>
-              <w:bottom w:w="100" w:type="dxa"/>
-              <w:left w:w="50" w:type="dxa"/>
-              <w:right w:w="50" w:type="dxa"/>
-            </w:tcMar>
-          </w:tcPr>
-          <w:p>
-            <w:pPr>
-              <w:spacing w:after="0"/>
-            </w:pPr>
-          </w:p>
-        </w:tc>
-      </w:tr>
-      <w:tr>
-        <w:tc>
-          <w:tcPr>
-            <w:tcW w:type="dxa" w:w="1587"/>
-            <w:shd w:fill="FFFDF5"/>
-            <w:tcMar>
-              <w:top w:w="100" w:type="dxa"/>
-              <w:bottom w:w="100" w:type="dxa"/>
-              <w:left w:w="50" w:type="dxa"/>
-              <w:right w:w="50" w:type="dxa"/>
-            </w:tcMar>
-          </w:tcPr>
-          <w:p>
-            <w:pPr>
-              <w:spacing w:after="0"/>
-            </w:pPr>
-            <w:r>
-              <w:rPr>
-                <w:rFonts w:ascii="PingFang TC" w:hAnsi="PingFang TC"/>
-                <w:b/>
-                <w:color w:val="B8860B"/>
-                <w:sz w:val="16"/>
-              </w:rPr>
-              <w:t>龍社路 595 號</w:t>
-            </w:r>
-          </w:p>
-        </w:tc>
-        <w:tc>
-          <w:tcPr>
-            <w:tcW w:type="dxa" w:w="1474"/>
-            <w:shd w:fill="FAF8F2"/>
-            <w:tcMar>
-              <w:top w:w="100" w:type="dxa"/>
-              <w:bottom w:w="100" w:type="dxa"/>
-              <w:left w:w="50" w:type="dxa"/>
-              <w:right w:w="50" w:type="dxa"/>
-            </w:tcMar>
-          </w:tcPr>
-          <w:p>
-            <w:pPr>
-              <w:spacing w:after="0"/>
-            </w:pPr>
-          </w:p>
-        </w:tc>
-        <w:tc>
-          <w:tcPr>
-            <w:tcW w:type="dxa" w:w="1587"/>
-            <w:shd w:fill="FAF8F2"/>
-            <w:tcMar>
-              <w:top w:w="100" w:type="dxa"/>
-              <w:bottom w:w="100" w:type="dxa"/>
-              <w:left w:w="50" w:type="dxa"/>
-              <w:right w:w="50" w:type="dxa"/>
-            </w:tcMar>
-          </w:tcPr>
-          <w:p>
-            <w:pPr>
-              <w:spacing w:after="0"/>
-            </w:pPr>
-          </w:p>
-        </w:tc>
-        <w:tc>
-          <w:tcPr>
-            <w:tcW w:type="dxa" w:w="1587"/>
-            <w:shd w:fill="FAF8F2"/>
-            <w:tcMar>
-              <w:top w:w="100" w:type="dxa"/>
-              <w:bottom w:w="100" w:type="dxa"/>
-              <w:left w:w="50" w:type="dxa"/>
-              <w:right w:w="50" w:type="dxa"/>
-            </w:tcMar>
-          </w:tcPr>
-          <w:p>
-            <w:pPr>
-              <w:spacing w:after="0"/>
-            </w:pPr>
-          </w:p>
-        </w:tc>
-        <w:tc>
-          <w:tcPr>
-            <w:tcW w:type="dxa" w:w="1928"/>
-            <w:shd w:fill="FAF8F2"/>
-            <w:tcMar>
-              <w:top w:w="100" w:type="dxa"/>
-              <w:bottom w:w="100" w:type="dxa"/>
-              <w:left w:w="50" w:type="dxa"/>
-              <w:right w:w="50" w:type="dxa"/>
-            </w:tcMar>
-          </w:tcPr>
-          <w:p>
-            <w:pPr>
-              <w:spacing w:after="0"/>
-            </w:pPr>
-          </w:p>
-        </w:tc>
-        <w:tc>
-          <w:tcPr>
-            <w:tcW w:type="dxa" w:w="1701"/>
-            <w:shd w:fill="FAF8F2"/>
-            <w:tcMar>
-              <w:top w:w="100" w:type="dxa"/>
-              <w:bottom w:w="100" w:type="dxa"/>
-              <w:left w:w="50" w:type="dxa"/>
-              <w:right w:w="50" w:type="dxa"/>
-            </w:tcMar>
-          </w:tcPr>
-          <w:p>
-            <w:pPr>
-              <w:spacing w:after="0"/>
-            </w:pPr>
-          </w:p>
-        </w:tc>
-      </w:tr>
-      <w:tr>
-        <w:tc>
-          <w:tcPr>
-            <w:tcW w:type="dxa" w:w="1587"/>
-            <w:shd w:fill="FFFDF5"/>
-            <w:tcMar>
-              <w:top w:w="100" w:type="dxa"/>
-              <w:bottom w:w="100" w:type="dxa"/>
-              <w:left w:w="50" w:type="dxa"/>
-              <w:right w:w="50" w:type="dxa"/>
-            </w:tcMar>
-          </w:tcPr>
-          <w:p>
-            <w:pPr>
-              <w:spacing w:after="0"/>
-            </w:pPr>
-            <w:r>
-              <w:rPr>
-                <w:rFonts w:ascii="PingFang TC" w:hAnsi="PingFang TC"/>
-                <w:b/>
-                <w:color w:val="B8860B"/>
-                <w:sz w:val="16"/>
-              </w:rPr>
-              <w:t>龍社路 597 號</w:t>
-            </w:r>
-          </w:p>
-        </w:tc>
-        <w:tc>
-          <w:tcPr>
-            <w:tcW w:type="dxa" w:w="1474"/>
-            <w:shd w:fill="FFFFFF"/>
-            <w:tcMar>
-              <w:top w:w="100" w:type="dxa"/>
-              <w:bottom w:w="100" w:type="dxa"/>
-              <w:left w:w="50" w:type="dxa"/>
-              <w:right w:w="50" w:type="dxa"/>
-            </w:tcMar>
-          </w:tcPr>
-          <w:p>
-            <w:pPr>
-              <w:spacing w:after="0"/>
-            </w:pPr>
-          </w:p>
-        </w:tc>
-        <w:tc>
-          <w:tcPr>
-            <w:tcW w:type="dxa" w:w="1587"/>
-            <w:shd w:fill="FFFFFF"/>
-            <w:tcMar>
-              <w:top w:w="100" w:type="dxa"/>
-              <w:bottom w:w="100" w:type="dxa"/>
-              <w:left w:w="50" w:type="dxa"/>
-              <w:right w:w="50" w:type="dxa"/>
-            </w:tcMar>
-          </w:tcPr>
-          <w:p>
-            <w:pPr>
-              <w:spacing w:after="0"/>
-            </w:pPr>
-          </w:p>
-        </w:tc>
-        <w:tc>
-          <w:tcPr>
-            <w:tcW w:type="dxa" w:w="1587"/>
-            <w:shd w:fill="FFFFFF"/>
-            <w:tcMar>
-              <w:top w:w="100" w:type="dxa"/>
-              <w:bottom w:w="100" w:type="dxa"/>
-              <w:left w:w="50" w:type="dxa"/>
-              <w:right w:w="50" w:type="dxa"/>
-            </w:tcMar>
-          </w:tcPr>
-          <w:p>
-            <w:pPr>
-              <w:spacing w:after="0"/>
-            </w:pPr>
-          </w:p>
-        </w:tc>
-        <w:tc>
-          <w:tcPr>
-            <w:tcW w:type="dxa" w:w="1928"/>
-            <w:shd w:fill="FFFFFF"/>
-            <w:tcMar>
-              <w:top w:w="100" w:type="dxa"/>
-              <w:bottom w:w="100" w:type="dxa"/>
-              <w:left w:w="50" w:type="dxa"/>
-              <w:right w:w="50" w:type="dxa"/>
-            </w:tcMar>
-          </w:tcPr>
-          <w:p>
-            <w:pPr>
-              <w:spacing w:after="0"/>
-            </w:pPr>
-          </w:p>
-        </w:tc>
-        <w:tc>
-          <w:tcPr>
-            <w:tcW w:type="dxa" w:w="1701"/>
-            <w:shd w:fill="FFFFFF"/>
-            <w:tcMar>
-              <w:top w:w="100" w:type="dxa"/>
-              <w:bottom w:w="100" w:type="dxa"/>
-              <w:left w:w="50" w:type="dxa"/>
-              <w:right w:w="50" w:type="dxa"/>
-            </w:tcMar>
-          </w:tcPr>
-          <w:p>
-            <w:pPr>
-              <w:spacing w:after="0"/>
-            </w:pPr>
-          </w:p>
-        </w:tc>
-      </w:tr>
-      <w:tr>
-        <w:tc>
-          <w:tcPr>
-            <w:tcW w:type="dxa" w:w="1587"/>
-            <w:shd w:fill="FFFDF5"/>
-            <w:tcMar>
-              <w:top w:w="100" w:type="dxa"/>
-              <w:bottom w:w="100" w:type="dxa"/>
-              <w:left w:w="50" w:type="dxa"/>
-              <w:right w:w="50" w:type="dxa"/>
-            </w:tcMar>
-          </w:tcPr>
-          <w:p>
-            <w:pPr>
-              <w:spacing w:after="0"/>
-            </w:pPr>
-            <w:r>
-              <w:rPr>
-                <w:rFonts w:ascii="PingFang TC" w:hAnsi="PingFang TC"/>
-                <w:b/>
-                <w:color w:val="B8860B"/>
-                <w:sz w:val="16"/>
-              </w:rPr>
-              <w:t>龍社路 599 號</w:t>
-            </w:r>
-          </w:p>
-        </w:tc>
-        <w:tc>
-          <w:tcPr>
-            <w:tcW w:type="dxa" w:w="1474"/>
-            <w:shd w:fill="FAF8F2"/>
-            <w:tcMar>
-              <w:top w:w="100" w:type="dxa"/>
-              <w:bottom w:w="100" w:type="dxa"/>
-              <w:left w:w="50" w:type="dxa"/>
-              <w:right w:w="50" w:type="dxa"/>
-            </w:tcMar>
-          </w:tcPr>
-          <w:p>
-            <w:pPr>
-              <w:spacing w:after="0"/>
-            </w:pPr>
-          </w:p>
-        </w:tc>
-        <w:tc>
-          <w:tcPr>
-            <w:tcW w:type="dxa" w:w="1587"/>
-            <w:shd w:fill="FAF8F2"/>
-            <w:tcMar>
-              <w:top w:w="100" w:type="dxa"/>
-              <w:bottom w:w="100" w:type="dxa"/>
-              <w:left w:w="50" w:type="dxa"/>
-              <w:right w:w="50" w:type="dxa"/>
-            </w:tcMar>
-          </w:tcPr>
-          <w:p>
-            <w:pPr>
-              <w:spacing w:after="0"/>
-            </w:pPr>
-          </w:p>
-        </w:tc>
-        <w:tc>
-          <w:tcPr>
-            <w:tcW w:type="dxa" w:w="1587"/>
-            <w:shd w:fill="FAF8F2"/>
-            <w:tcMar>
-              <w:top w:w="100" w:type="dxa"/>
-              <w:bottom w:w="100" w:type="dxa"/>
-              <w:left w:w="50" w:type="dxa"/>
-              <w:right w:w="50" w:type="dxa"/>
-            </w:tcMar>
-          </w:tcPr>
-          <w:p>
-            <w:pPr>
-              <w:spacing w:after="0"/>
-            </w:pPr>
-          </w:p>
-        </w:tc>
-        <w:tc>
-          <w:tcPr>
-            <w:tcW w:type="dxa" w:w="1928"/>
-            <w:shd w:fill="FAF8F2"/>
-            <w:tcMar>
-              <w:top w:w="100" w:type="dxa"/>
-              <w:bottom w:w="100" w:type="dxa"/>
-              <w:left w:w="50" w:type="dxa"/>
-              <w:right w:w="50" w:type="dxa"/>
-            </w:tcMar>
-          </w:tcPr>
-          <w:p>
-            <w:pPr>
-              <w:spacing w:after="0"/>
-            </w:pPr>
-          </w:p>
-        </w:tc>
-        <w:tc>
-          <w:tcPr>
-            <w:tcW w:type="dxa" w:w="1701"/>
-            <w:shd w:fill="FAF8F2"/>
-            <w:tcMar>
-              <w:top w:w="100" w:type="dxa"/>
-              <w:bottom w:w="100" w:type="dxa"/>
-              <w:left w:w="50" w:type="dxa"/>
-              <w:right w:w="50" w:type="dxa"/>
-            </w:tcMar>
-          </w:tcPr>
-          <w:p>
-            <w:pPr>
-              <w:spacing w:after="0"/>
-            </w:pPr>
-          </w:p>
-        </w:tc>
-      </w:tr>
-      <w:tr>
-        <w:tc>
-          <w:tcPr>
-            <w:tcW w:type="dxa" w:w="1587"/>
-            <w:shd w:fill="FFFDF5"/>
-            <w:tcMar>
-              <w:top w:w="100" w:type="dxa"/>
-              <w:bottom w:w="100" w:type="dxa"/>
-              <w:left w:w="50" w:type="dxa"/>
-              <w:right w:w="50" w:type="dxa"/>
-            </w:tcMar>
-          </w:tcPr>
-          <w:p>
-            <w:pPr>
-              <w:spacing w:after="0"/>
-            </w:pPr>
-            <w:r>
-              <w:rPr>
-                <w:rFonts w:ascii="PingFang TC" w:hAnsi="PingFang TC"/>
-                <w:b/>
-                <w:color w:val="B8860B"/>
-                <w:sz w:val="16"/>
-              </w:rPr>
-              <w:t>龍社路 601 號</w:t>
-            </w:r>
-          </w:p>
-        </w:tc>
-        <w:tc>
-          <w:tcPr>
-            <w:tcW w:type="dxa" w:w="1474"/>
-            <w:shd w:fill="FFFFFF"/>
-            <w:tcMar>
-              <w:top w:w="100" w:type="dxa"/>
-              <w:bottom w:w="100" w:type="dxa"/>
-              <w:left w:w="50" w:type="dxa"/>
-              <w:right w:w="50" w:type="dxa"/>
-            </w:tcMar>
-          </w:tcPr>
-          <w:p>
-            <w:pPr>
-              <w:spacing w:after="0"/>
-            </w:pPr>
-          </w:p>
-        </w:tc>
-        <w:tc>
-          <w:tcPr>
-            <w:tcW w:type="dxa" w:w="1587"/>
-            <w:shd w:fill="FFFFFF"/>
-            <w:tcMar>
-              <w:top w:w="100" w:type="dxa"/>
-              <w:bottom w:w="100" w:type="dxa"/>
-              <w:left w:w="50" w:type="dxa"/>
-              <w:right w:w="50" w:type="dxa"/>
-            </w:tcMar>
-          </w:tcPr>
-          <w:p>
-            <w:pPr>
-              <w:spacing w:after="0"/>
-            </w:pPr>
-          </w:p>
-        </w:tc>
-        <w:tc>
-          <w:tcPr>
-            <w:tcW w:type="dxa" w:w="1587"/>
-            <w:shd w:fill="FFFFFF"/>
-            <w:tcMar>
-              <w:top w:w="100" w:type="dxa"/>
-              <w:bottom w:w="100" w:type="dxa"/>
-              <w:left w:w="50" w:type="dxa"/>
-              <w:right w:w="50" w:type="dxa"/>
-            </w:tcMar>
-          </w:tcPr>
-          <w:p>
-            <w:pPr>
-              <w:spacing w:after="0"/>
-            </w:pPr>
-          </w:p>
-        </w:tc>
-        <w:tc>
-          <w:tcPr>
-            <w:tcW w:type="dxa" w:w="1928"/>
-            <w:shd w:fill="FFFFFF"/>
-            <w:tcMar>
-              <w:top w:w="100" w:type="dxa"/>
-              <w:bottom w:w="100" w:type="dxa"/>
-              <w:left w:w="50" w:type="dxa"/>
-              <w:right w:w="50" w:type="dxa"/>
-            </w:tcMar>
-          </w:tcPr>
-          <w:p>
-            <w:pPr>
-              <w:spacing w:after="0"/>
-            </w:pPr>
-          </w:p>
-        </w:tc>
-        <w:tc>
-          <w:tcPr>
-            <w:tcW w:type="dxa" w:w="1701"/>
-            <w:shd w:fill="FFFFFF"/>
-            <w:tcMar>
-              <w:top w:w="100" w:type="dxa"/>
-              <w:bottom w:w="100" w:type="dxa"/>
-              <w:left w:w="50" w:type="dxa"/>
-              <w:right w:w="50" w:type="dxa"/>
-            </w:tcMar>
-          </w:tcPr>
-          <w:p>
-            <w:pPr>
-              <w:spacing w:after="0"/>
-            </w:pPr>
-          </w:p>
-        </w:tc>
-      </w:tr>
-      <w:tr>
-        <w:tc>
-          <w:tcPr>
-            <w:tcW w:type="dxa" w:w="1587"/>
-            <w:shd w:fill="FFFDF5"/>
-            <w:tcMar>
-              <w:top w:w="100" w:type="dxa"/>
-              <w:bottom w:w="100" w:type="dxa"/>
-              <w:left w:w="50" w:type="dxa"/>
-              <w:right w:w="50" w:type="dxa"/>
-            </w:tcMar>
-          </w:tcPr>
-          <w:p>
-            <w:pPr>
-              <w:spacing w:after="0"/>
-            </w:pPr>
-            <w:r>
-              <w:rPr>
-                <w:rFonts w:ascii="PingFang TC" w:hAnsi="PingFang TC"/>
-                <w:b/>
-                <w:color w:val="B8860B"/>
-                <w:sz w:val="16"/>
-              </w:rPr>
-              <w:t>龍社路 603 號</w:t>
-            </w:r>
-          </w:p>
-        </w:tc>
-        <w:tc>
-          <w:tcPr>
-            <w:tcW w:type="dxa" w:w="1474"/>
-            <w:shd w:fill="FAF8F2"/>
-            <w:tcMar>
-              <w:top w:w="100" w:type="dxa"/>
-              <w:bottom w:w="100" w:type="dxa"/>
-              <w:left w:w="50" w:type="dxa"/>
-              <w:right w:w="50" w:type="dxa"/>
-            </w:tcMar>
-          </w:tcPr>
-          <w:p>
-            <w:pPr>
-              <w:spacing w:after="0"/>
-            </w:pPr>
-          </w:p>
-        </w:tc>
-        <w:tc>
-          <w:tcPr>
-            <w:tcW w:type="dxa" w:w="1587"/>
-            <w:shd w:fill="FAF8F2"/>
-            <w:tcMar>
-              <w:top w:w="100" w:type="dxa"/>
-              <w:bottom w:w="100" w:type="dxa"/>
-              <w:left w:w="50" w:type="dxa"/>
-              <w:right w:w="50" w:type="dxa"/>
-            </w:tcMar>
-          </w:tcPr>
-          <w:p>
-            <w:pPr>
-              <w:spacing w:after="0"/>
-            </w:pPr>
-          </w:p>
-        </w:tc>
-        <w:tc>
-          <w:tcPr>
-            <w:tcW w:type="dxa" w:w="1587"/>
-            <w:shd w:fill="FAF8F2"/>
-            <w:tcMar>
-              <w:top w:w="100" w:type="dxa"/>
-              <w:bottom w:w="100" w:type="dxa"/>
-              <w:left w:w="50" w:type="dxa"/>
-              <w:right w:w="50" w:type="dxa"/>
-            </w:tcMar>
-          </w:tcPr>
-          <w:p>
-            <w:pPr>
-              <w:spacing w:after="0"/>
-            </w:pPr>
-          </w:p>
-        </w:tc>
-        <w:tc>
-          <w:tcPr>
-            <w:tcW w:type="dxa" w:w="1928"/>
-            <w:shd w:fill="FAF8F2"/>
-            <w:tcMar>
-              <w:top w:w="100" w:type="dxa"/>
-              <w:bottom w:w="100" w:type="dxa"/>
-              <w:left w:w="50" w:type="dxa"/>
-              <w:right w:w="50" w:type="dxa"/>
-            </w:tcMar>
-          </w:tcPr>
-          <w:p>
-            <w:pPr>
-              <w:spacing w:after="0"/>
-            </w:pPr>
-          </w:p>
-        </w:tc>
-        <w:tc>
-          <w:tcPr>
-            <w:tcW w:type="dxa" w:w="1701"/>
-            <w:shd w:fill="FAF8F2"/>
-            <w:tcMar>
-              <w:top w:w="100" w:type="dxa"/>
-              <w:bottom w:w="100" w:type="dxa"/>
-              <w:left w:w="50" w:type="dxa"/>
-              <w:right w:w="50" w:type="dxa"/>
-            </w:tcMar>
-          </w:tcPr>
-          <w:p>
-            <w:pPr>
-              <w:spacing w:after="0"/>
-            </w:pPr>
           </w:p>
         </w:tc>
       </w:tr>
@@ -1232,40 +193,992 @@
           <w:rFonts w:ascii="PingFang TC" w:hAnsi="PingFang TC"/>
           <w:b/>
           <w:color w:val="B8860B"/>
-          <w:sz w:val="17"/>
+          <w:sz w:val="24"/>
         </w:rPr>
-        <w:t>【檢附證物清冊】</w:t>
-        <w:br/>
+        <w:t>【請求調處事項】</w:t>
+      </w:r>
+    </w:p>
+    <w:p>
+      <w:pPr>
+        <w:spacing w:line="324" w:lineRule="auto" w:after="60"/>
+      </w:pPr>
+      <w:r>
+        <w:rPr>
+          <w:rFonts w:ascii="PingFang TC" w:hAnsi="PingFang TC"/>
+          <w:color w:val="22252A"/>
+          <w:sz w:val="22"/>
+        </w:rPr>
+        <w:t>一、請求調處確認申請人 6 戶建物依《公寓大廈管理條例》第 53 條自相對人「富宇大地」管理組織範圍合意分流退出，回歸自用獨立透天住宅生活，不另成立管理委員會，並由建物管轄區公所准予變更備查。</w:t>
+      </w:r>
+    </w:p>
+    <w:p>
+      <w:pPr>
+        <w:spacing w:line="324" w:lineRule="auto" w:after="60"/>
+      </w:pPr>
+      <w:r>
+        <w:rPr>
+          <w:rFonts w:ascii="PingFang TC" w:hAnsi="PingFang TC"/>
+          <w:color w:val="22252A"/>
+          <w:sz w:val="22"/>
+        </w:rPr>
+        <w:t>二、請求相對人於分流核准後，將專單立卷保管之新光銀行沙鹿分行「A2 大境定存單本息（NT$ 220,231 元）」及交屋管理基金（每戶 1 萬共 NT$ 60,000 元，合計約 28.4 萬元）依戶數均分，全額撥還退交申請人 6 戶區權人（每戶約退還 NT$ 47,455 元）。</w:t>
+      </w:r>
+    </w:p>
+    <w:p>
+      <w:pPr>
+        <w:spacing w:line="324" w:lineRule="auto" w:after="60"/>
+      </w:pPr>
+      <w:r>
+        <w:rPr>
+          <w:rFonts w:ascii="PingFang TC" w:hAnsi="PingFang TC"/>
+          <w:color w:val="22252A"/>
+          <w:sz w:val="22"/>
+        </w:rPr>
+        <w:t>三、請求確認自調處成立生效日起，申請人 6 戶終止繳納相對人每月管理費，相對人亦免除對申請人門前路段之巡查維護責任。</w:t>
+      </w:r>
+    </w:p>
+    <w:p>
+      <w:pPr>
+        <w:spacing w:before="160" w:after="40"/>
+      </w:pPr>
+      <w:r>
+        <w:rPr>
+          <w:rFonts w:ascii="PingFang TC" w:hAnsi="PingFang TC"/>
+          <w:b/>
+          <w:color w:val="B8860B"/>
+          <w:sz w:val="24"/>
+        </w:rPr>
+        <w:t>【事實及理由摘要】</w:t>
+      </w:r>
+    </w:p>
+    <w:p>
+      <w:pPr>
+        <w:spacing w:line="324" w:lineRule="auto" w:after="60"/>
+      </w:pPr>
+      <w:r>
+        <w:rPr>
+          <w:rFonts w:ascii="PingFang TC" w:hAnsi="PingFang TC"/>
+          <w:b/>
+          <w:color w:val="B8860B"/>
+          <w:sz w:val="22"/>
+        </w:rPr>
+        <w:t>一、出入與機能獨立無公設不可分性：</w:t>
       </w:r>
       <w:r>
         <w:rPr>
           <w:rFonts w:ascii="PingFang TC" w:hAnsi="PingFang TC"/>
-          <w:color w:val="1A1D20"/>
-          <w:sz w:val="15"/>
+          <w:color w:val="22252A"/>
+          <w:sz w:val="22"/>
         </w:rPr>
-        <w:t>證物一：《法定獨立分割可行性研究報告書》（7 頁審計法理全本，論證第 53 條分流及雙贏效益）</w:t>
-        <w:br/>
-        <w:t>證物二：《富宇大地全區地籍圖及出入證明》（官方地籍配置圖說，佐證面臨龍社路公有道路獨立出入）</w:t>
-        <w:br/>
-        <w:t>證物三：《富宇大地 115 年 5 月例會議決與 9 月定存財報》（佐證 A2 定存單 NT$ 220,231 元專單保管）</w:t>
-        <w:br/>
-        <w:t>證物四：《共用設施無依賴切結與生活垃圾自行清運承諾書》（切結水電排污自理與放棄使用收費子母車）</w:t>
-        <w:br/>
-        <w:t>證物五：《專案全權委任授權書》（載明民法第 534 條爭議調處與和解之特別代理權）</w:t>
-        <w:br/>
-        <w:t>證物六：建物所有權第一類登記謄本清冊（6 戶區分所有權人身分資格證明）</w:t>
+        <w:t>申請人 6 戶透天座落沙鹿區龍社路 593～603 號，直接面臨公有計畫道路獨立出入，無須經由相對人內部巷道；自來水、自用電表、生活排水與化糞均獨立自理；生活廢棄物門前等候免費公有清潔隊清運，且已切結自願放棄使用相對人內部收費子母車，客觀上無《條例》第 53 條所稱「共用設施整體不可分性」。</w:t>
       </w:r>
     </w:p>
     <w:p>
       <w:pPr>
-        <w:spacing w:before="120" w:after="0"/>
+        <w:spacing w:line="324" w:lineRule="auto" w:after="60"/>
+      </w:pPr>
+      <w:r>
+        <w:rPr>
+          <w:rFonts w:ascii="PingFang TC" w:hAnsi="PingFang TC"/>
+          <w:b/>
+          <w:color w:val="B8860B"/>
+          <w:sz w:val="22"/>
+        </w:rPr>
+        <w:t>二、定存專單獨立立卷且帳目清楚：</w:t>
+      </w:r>
+      <w:r>
+        <w:rPr>
+          <w:rFonts w:ascii="PingFang TC" w:hAnsi="PingFang TC"/>
+          <w:color w:val="22252A"/>
+          <w:sz w:val="22"/>
+        </w:rPr>
+        <w:t>相對人 115 年 5 月例會議決及 9 月財報已明確將核退公款獨立開立「A2 大境定存單 NT$ 220,231 元」專單保管；起造人交屋基金每戶 1 萬元亦為專款。移交純屬專款原單專案歸位，相對人 235 戶之原有數百萬元公共基金分毫不受影響。</w:t>
+      </w:r>
+    </w:p>
+    <w:p>
+      <w:pPr>
+        <w:spacing w:line="324" w:lineRule="auto" w:after="60"/>
+      </w:pPr>
+      <w:r>
+        <w:rPr>
+          <w:rFonts w:ascii="PingFang TC" w:hAnsi="PingFang TC"/>
+          <w:b/>
+          <w:color w:val="B8860B"/>
+          <w:sz w:val="22"/>
+        </w:rPr>
+        <w:t>三、雙贏互惠並消弭大社區管理負擔：</w:t>
+      </w:r>
+      <w:r>
+        <w:rPr>
+          <w:rFonts w:ascii="PingFang TC" w:hAnsi="PingFang TC"/>
+          <w:color w:val="22252A"/>
+          <w:sz w:val="22"/>
+        </w:rPr>
+        <w:t>分流後相對人責任聚焦於封閉式內部 235 戶，免除跨路巡檢與外側安全民事責任；內部子母車容量 100% 留給內部 235 戶使用。特依法聲請調處作成和解筆錄，促進社區自治與和諧共榮。</w:t>
+      </w:r>
+    </w:p>
+    <w:p>
+      <w:r>
+        <w:br w:type="page"/>
+      </w:r>
+    </w:p>
+    <w:p>
+      <w:pPr>
+        <w:spacing w:before="80" w:after="80"/>
+        <w:jc w:val="center"/>
+      </w:pPr>
+      <w:r>
+        <w:rPr>
+          <w:rFonts w:ascii="PingFang TC" w:hAnsi="PingFang TC"/>
+          <w:b/>
+          <w:color w:val="B8860B"/>
+          <w:sz w:val="30"/>
+        </w:rPr>
+        <w:t>富宇大境（A2 區・6 戶）全體區分所有權人調處申請簽章冊</w:t>
+      </w:r>
+    </w:p>
+    <w:p>
+      <w:pPr>
+        <w:spacing w:after="120"/>
+      </w:pPr>
+      <w:r>
+        <w:rPr>
+          <w:rFonts w:ascii="PingFang TC" w:hAnsi="PingFang TC"/>
+          <w:color w:val="22252A"/>
+          <w:sz w:val="21"/>
+        </w:rPr>
+        <w:t>全體申請人確認申請事項屬實，並特別授權 廖倫豪 博士代表出席臺中市政府調處會議、作成和解及簽署調處筆錄：</w:t>
+      </w:r>
+    </w:p>
+    <w:tbl>
+      <w:tblPr>
+        <w:tblW w:type="auto" w:w="0"/>
+        <w:jc w:val="center"/>
+        <w:tblLook w:firstColumn="1" w:firstRow="1" w:lastColumn="0" w:lastRow="0" w:noHBand="0" w:noVBand="1" w:val="04A0"/>
+      </w:tblPr>
+      <w:tblGrid>
+        <w:gridCol w:w="1586"/>
+        <w:gridCol w:w="1586"/>
+        <w:gridCol w:w="1586"/>
+        <w:gridCol w:w="1586"/>
+        <w:gridCol w:w="1586"/>
+        <w:gridCol w:w="1586"/>
+      </w:tblGrid>
+      <w:tr>
+        <w:tc>
+          <w:tcPr>
+            <w:tcW w:type="dxa" w:w="1586"/>
+            <w:shd w:fill="1A1D20"/>
+            <w:tcMar>
+              <w:top w:w="50" w:type="dxa"/>
+              <w:bottom w:w="50" w:type="dxa"/>
+              <w:left w:w="40" w:type="dxa"/>
+              <w:right w:w="40" w:type="dxa"/>
+            </w:tcMar>
+          </w:tcPr>
+          <w:p>
+            <w:r>
+              <w:rPr>
+                <w:rFonts w:ascii="PingFang TC" w:hAnsi="PingFang TC"/>
+                <w:b/>
+                <w:color w:val="D4AF37"/>
+                <w:sz w:val="19"/>
+              </w:rPr>
+              <w:t>戶號門牌</w:t>
+            </w:r>
+          </w:p>
+        </w:tc>
+        <w:tc>
+          <w:tcPr>
+            <w:tcW w:type="dxa" w:w="1586"/>
+            <w:shd w:fill="1A1D20"/>
+            <w:tcMar>
+              <w:top w:w="50" w:type="dxa"/>
+              <w:bottom w:w="50" w:type="dxa"/>
+              <w:left w:w="40" w:type="dxa"/>
+              <w:right w:w="40" w:type="dxa"/>
+            </w:tcMar>
+          </w:tcPr>
+          <w:p>
+            <w:r>
+              <w:rPr>
+                <w:rFonts w:ascii="PingFang TC" w:hAnsi="PingFang TC"/>
+                <w:b/>
+                <w:color w:val="D4AF37"/>
+                <w:sz w:val="19"/>
+              </w:rPr>
+              <w:t>區權人姓名</w:t>
+            </w:r>
+          </w:p>
+        </w:tc>
+        <w:tc>
+          <w:tcPr>
+            <w:tcW w:type="dxa" w:w="1586"/>
+            <w:shd w:fill="1A1D20"/>
+            <w:tcMar>
+              <w:top w:w="50" w:type="dxa"/>
+              <w:bottom w:w="50" w:type="dxa"/>
+              <w:left w:w="40" w:type="dxa"/>
+              <w:right w:w="40" w:type="dxa"/>
+            </w:tcMar>
+          </w:tcPr>
+          <w:p>
+            <w:r>
+              <w:rPr>
+                <w:rFonts w:ascii="PingFang TC" w:hAnsi="PingFang TC"/>
+                <w:b/>
+                <w:color w:val="D4AF37"/>
+                <w:sz w:val="19"/>
+              </w:rPr>
+              <w:t>身分證字號</w:t>
+            </w:r>
+          </w:p>
+        </w:tc>
+        <w:tc>
+          <w:tcPr>
+            <w:tcW w:type="dxa" w:w="1586"/>
+            <w:shd w:fill="1A1D20"/>
+            <w:tcMar>
+              <w:top w:w="50" w:type="dxa"/>
+              <w:bottom w:w="50" w:type="dxa"/>
+              <w:left w:w="40" w:type="dxa"/>
+              <w:right w:w="40" w:type="dxa"/>
+            </w:tcMar>
+          </w:tcPr>
+          <w:p>
+            <w:r>
+              <w:rPr>
+                <w:rFonts w:ascii="PingFang TC" w:hAnsi="PingFang TC"/>
+                <w:b/>
+                <w:color w:val="D4AF37"/>
+                <w:sz w:val="19"/>
+              </w:rPr>
+              <w:t>聯絡電話</w:t>
+            </w:r>
+          </w:p>
+        </w:tc>
+        <w:tc>
+          <w:tcPr>
+            <w:tcW w:type="dxa" w:w="1586"/>
+            <w:shd w:fill="1A1D20"/>
+            <w:tcMar>
+              <w:top w:w="50" w:type="dxa"/>
+              <w:bottom w:w="50" w:type="dxa"/>
+              <w:left w:w="40" w:type="dxa"/>
+              <w:right w:w="40" w:type="dxa"/>
+            </w:tcMar>
+          </w:tcPr>
+          <w:p>
+            <w:r>
+              <w:rPr>
+                <w:rFonts w:ascii="PingFang TC" w:hAnsi="PingFang TC"/>
+                <w:b/>
+                <w:color w:val="D4AF37"/>
+                <w:sz w:val="19"/>
+              </w:rPr>
+              <w:t>親筆簽名</w:t>
+            </w:r>
+          </w:p>
+        </w:tc>
+        <w:tc>
+          <w:tcPr>
+            <w:tcW w:type="dxa" w:w="1586"/>
+            <w:shd w:fill="1A1D20"/>
+            <w:tcMar>
+              <w:top w:w="50" w:type="dxa"/>
+              <w:bottom w:w="50" w:type="dxa"/>
+              <w:left w:w="40" w:type="dxa"/>
+              <w:right w:w="40" w:type="dxa"/>
+            </w:tcMar>
+          </w:tcPr>
+          <w:p>
+            <w:r>
+              <w:rPr>
+                <w:rFonts w:ascii="PingFang TC" w:hAnsi="PingFang TC"/>
+                <w:b/>
+                <w:color w:val="D4AF37"/>
+                <w:sz w:val="19"/>
+              </w:rPr>
+              <w:t>印鑑蓋章 / 日期</w:t>
+            </w:r>
+          </w:p>
+        </w:tc>
+      </w:tr>
+      <w:tr>
+        <w:tc>
+          <w:tcPr>
+            <w:tcW w:type="dxa" w:w="1586"/>
+            <w:shd w:fill="FFFDF5"/>
+            <w:tcMar>
+              <w:top w:w="70" w:type="dxa"/>
+              <w:bottom w:w="70" w:type="dxa"/>
+              <w:left w:w="40" w:type="dxa"/>
+              <w:right w:w="40" w:type="dxa"/>
+            </w:tcMar>
+          </w:tcPr>
+          <w:p>
+            <w:r>
+              <w:rPr>
+                <w:rFonts w:ascii="PingFang TC" w:hAnsi="PingFang TC"/>
+                <w:b/>
+                <w:color w:val="B8860B"/>
+                <w:sz w:val="19"/>
+              </w:rPr>
+              <w:t>龍社路 593 號</w:t>
+            </w:r>
+          </w:p>
+        </w:tc>
+        <w:tc>
+          <w:tcPr>
+            <w:tcW w:type="dxa" w:w="1586"/>
+            <w:shd w:fill="FFFFFF"/>
+            <w:tcMar>
+              <w:top w:w="70" w:type="dxa"/>
+              <w:bottom w:w="70" w:type="dxa"/>
+              <w:left w:w="40" w:type="dxa"/>
+              <w:right w:w="40" w:type="dxa"/>
+            </w:tcMar>
+          </w:tcPr>
+          <w:p/>
+        </w:tc>
+        <w:tc>
+          <w:tcPr>
+            <w:tcW w:type="dxa" w:w="1586"/>
+            <w:shd w:fill="FFFFFF"/>
+            <w:tcMar>
+              <w:top w:w="70" w:type="dxa"/>
+              <w:bottom w:w="70" w:type="dxa"/>
+              <w:left w:w="40" w:type="dxa"/>
+              <w:right w:w="40" w:type="dxa"/>
+            </w:tcMar>
+          </w:tcPr>
+          <w:p/>
+        </w:tc>
+        <w:tc>
+          <w:tcPr>
+            <w:tcW w:type="dxa" w:w="1586"/>
+            <w:shd w:fill="FFFFFF"/>
+            <w:tcMar>
+              <w:top w:w="70" w:type="dxa"/>
+              <w:bottom w:w="70" w:type="dxa"/>
+              <w:left w:w="40" w:type="dxa"/>
+              <w:right w:w="40" w:type="dxa"/>
+            </w:tcMar>
+          </w:tcPr>
+          <w:p/>
+        </w:tc>
+        <w:tc>
+          <w:tcPr>
+            <w:tcW w:type="dxa" w:w="1586"/>
+            <w:shd w:fill="FFFFFF"/>
+            <w:tcMar>
+              <w:top w:w="70" w:type="dxa"/>
+              <w:bottom w:w="70" w:type="dxa"/>
+              <w:left w:w="40" w:type="dxa"/>
+              <w:right w:w="40" w:type="dxa"/>
+            </w:tcMar>
+          </w:tcPr>
+          <w:p/>
+        </w:tc>
+        <w:tc>
+          <w:tcPr>
+            <w:tcW w:type="dxa" w:w="1586"/>
+            <w:shd w:fill="FFFFFF"/>
+            <w:tcMar>
+              <w:top w:w="70" w:type="dxa"/>
+              <w:bottom w:w="70" w:type="dxa"/>
+              <w:left w:w="40" w:type="dxa"/>
+              <w:right w:w="40" w:type="dxa"/>
+            </w:tcMar>
+          </w:tcPr>
+          <w:p/>
+        </w:tc>
+      </w:tr>
+      <w:tr>
+        <w:tc>
+          <w:tcPr>
+            <w:tcW w:type="dxa" w:w="1586"/>
+            <w:shd w:fill="FFFDF5"/>
+            <w:tcMar>
+              <w:top w:w="70" w:type="dxa"/>
+              <w:bottom w:w="70" w:type="dxa"/>
+              <w:left w:w="40" w:type="dxa"/>
+              <w:right w:w="40" w:type="dxa"/>
+            </w:tcMar>
+          </w:tcPr>
+          <w:p>
+            <w:r>
+              <w:rPr>
+                <w:rFonts w:ascii="PingFang TC" w:hAnsi="PingFang TC"/>
+                <w:b/>
+                <w:color w:val="B8860B"/>
+                <w:sz w:val="19"/>
+              </w:rPr>
+              <w:t>龍社路 595 號</w:t>
+            </w:r>
+          </w:p>
+        </w:tc>
+        <w:tc>
+          <w:tcPr>
+            <w:tcW w:type="dxa" w:w="1586"/>
+            <w:shd w:fill="FAF8F2"/>
+            <w:tcMar>
+              <w:top w:w="70" w:type="dxa"/>
+              <w:bottom w:w="70" w:type="dxa"/>
+              <w:left w:w="40" w:type="dxa"/>
+              <w:right w:w="40" w:type="dxa"/>
+            </w:tcMar>
+          </w:tcPr>
+          <w:p/>
+        </w:tc>
+        <w:tc>
+          <w:tcPr>
+            <w:tcW w:type="dxa" w:w="1586"/>
+            <w:shd w:fill="FAF8F2"/>
+            <w:tcMar>
+              <w:top w:w="70" w:type="dxa"/>
+              <w:bottom w:w="70" w:type="dxa"/>
+              <w:left w:w="40" w:type="dxa"/>
+              <w:right w:w="40" w:type="dxa"/>
+            </w:tcMar>
+          </w:tcPr>
+          <w:p/>
+        </w:tc>
+        <w:tc>
+          <w:tcPr>
+            <w:tcW w:type="dxa" w:w="1586"/>
+            <w:shd w:fill="FAF8F2"/>
+            <w:tcMar>
+              <w:top w:w="70" w:type="dxa"/>
+              <w:bottom w:w="70" w:type="dxa"/>
+              <w:left w:w="40" w:type="dxa"/>
+              <w:right w:w="40" w:type="dxa"/>
+            </w:tcMar>
+          </w:tcPr>
+          <w:p/>
+        </w:tc>
+        <w:tc>
+          <w:tcPr>
+            <w:tcW w:type="dxa" w:w="1586"/>
+            <w:shd w:fill="FAF8F2"/>
+            <w:tcMar>
+              <w:top w:w="70" w:type="dxa"/>
+              <w:bottom w:w="70" w:type="dxa"/>
+              <w:left w:w="40" w:type="dxa"/>
+              <w:right w:w="40" w:type="dxa"/>
+            </w:tcMar>
+          </w:tcPr>
+          <w:p/>
+        </w:tc>
+        <w:tc>
+          <w:tcPr>
+            <w:tcW w:type="dxa" w:w="1586"/>
+            <w:shd w:fill="FAF8F2"/>
+            <w:tcMar>
+              <w:top w:w="70" w:type="dxa"/>
+              <w:bottom w:w="70" w:type="dxa"/>
+              <w:left w:w="40" w:type="dxa"/>
+              <w:right w:w="40" w:type="dxa"/>
+            </w:tcMar>
+          </w:tcPr>
+          <w:p/>
+        </w:tc>
+      </w:tr>
+      <w:tr>
+        <w:tc>
+          <w:tcPr>
+            <w:tcW w:type="dxa" w:w="1586"/>
+            <w:shd w:fill="FFFDF5"/>
+            <w:tcMar>
+              <w:top w:w="70" w:type="dxa"/>
+              <w:bottom w:w="70" w:type="dxa"/>
+              <w:left w:w="40" w:type="dxa"/>
+              <w:right w:w="40" w:type="dxa"/>
+            </w:tcMar>
+          </w:tcPr>
+          <w:p>
+            <w:r>
+              <w:rPr>
+                <w:rFonts w:ascii="PingFang TC" w:hAnsi="PingFang TC"/>
+                <w:b/>
+                <w:color w:val="B8860B"/>
+                <w:sz w:val="19"/>
+              </w:rPr>
+              <w:t>龍社路 597 號</w:t>
+            </w:r>
+          </w:p>
+        </w:tc>
+        <w:tc>
+          <w:tcPr>
+            <w:tcW w:type="dxa" w:w="1586"/>
+            <w:shd w:fill="FFFFFF"/>
+            <w:tcMar>
+              <w:top w:w="70" w:type="dxa"/>
+              <w:bottom w:w="70" w:type="dxa"/>
+              <w:left w:w="40" w:type="dxa"/>
+              <w:right w:w="40" w:type="dxa"/>
+            </w:tcMar>
+          </w:tcPr>
+          <w:p/>
+        </w:tc>
+        <w:tc>
+          <w:tcPr>
+            <w:tcW w:type="dxa" w:w="1586"/>
+            <w:shd w:fill="FFFFFF"/>
+            <w:tcMar>
+              <w:top w:w="70" w:type="dxa"/>
+              <w:bottom w:w="70" w:type="dxa"/>
+              <w:left w:w="40" w:type="dxa"/>
+              <w:right w:w="40" w:type="dxa"/>
+            </w:tcMar>
+          </w:tcPr>
+          <w:p/>
+        </w:tc>
+        <w:tc>
+          <w:tcPr>
+            <w:tcW w:type="dxa" w:w="1586"/>
+            <w:shd w:fill="FFFFFF"/>
+            <w:tcMar>
+              <w:top w:w="70" w:type="dxa"/>
+              <w:bottom w:w="70" w:type="dxa"/>
+              <w:left w:w="40" w:type="dxa"/>
+              <w:right w:w="40" w:type="dxa"/>
+            </w:tcMar>
+          </w:tcPr>
+          <w:p/>
+        </w:tc>
+        <w:tc>
+          <w:tcPr>
+            <w:tcW w:type="dxa" w:w="1586"/>
+            <w:shd w:fill="FFFFFF"/>
+            <w:tcMar>
+              <w:top w:w="70" w:type="dxa"/>
+              <w:bottom w:w="70" w:type="dxa"/>
+              <w:left w:w="40" w:type="dxa"/>
+              <w:right w:w="40" w:type="dxa"/>
+            </w:tcMar>
+          </w:tcPr>
+          <w:p/>
+        </w:tc>
+        <w:tc>
+          <w:tcPr>
+            <w:tcW w:type="dxa" w:w="1586"/>
+            <w:shd w:fill="FFFFFF"/>
+            <w:tcMar>
+              <w:top w:w="70" w:type="dxa"/>
+              <w:bottom w:w="70" w:type="dxa"/>
+              <w:left w:w="40" w:type="dxa"/>
+              <w:right w:w="40" w:type="dxa"/>
+            </w:tcMar>
+          </w:tcPr>
+          <w:p/>
+        </w:tc>
+      </w:tr>
+      <w:tr>
+        <w:tc>
+          <w:tcPr>
+            <w:tcW w:type="dxa" w:w="1586"/>
+            <w:shd w:fill="FFFDF5"/>
+            <w:tcMar>
+              <w:top w:w="70" w:type="dxa"/>
+              <w:bottom w:w="70" w:type="dxa"/>
+              <w:left w:w="40" w:type="dxa"/>
+              <w:right w:w="40" w:type="dxa"/>
+            </w:tcMar>
+          </w:tcPr>
+          <w:p>
+            <w:r>
+              <w:rPr>
+                <w:rFonts w:ascii="PingFang TC" w:hAnsi="PingFang TC"/>
+                <w:b/>
+                <w:color w:val="B8860B"/>
+                <w:sz w:val="19"/>
+              </w:rPr>
+              <w:t>龍社路 599 號</w:t>
+            </w:r>
+          </w:p>
+        </w:tc>
+        <w:tc>
+          <w:tcPr>
+            <w:tcW w:type="dxa" w:w="1586"/>
+            <w:shd w:fill="FAF8F2"/>
+            <w:tcMar>
+              <w:top w:w="70" w:type="dxa"/>
+              <w:bottom w:w="70" w:type="dxa"/>
+              <w:left w:w="40" w:type="dxa"/>
+              <w:right w:w="40" w:type="dxa"/>
+            </w:tcMar>
+          </w:tcPr>
+          <w:p/>
+        </w:tc>
+        <w:tc>
+          <w:tcPr>
+            <w:tcW w:type="dxa" w:w="1586"/>
+            <w:shd w:fill="FAF8F2"/>
+            <w:tcMar>
+              <w:top w:w="70" w:type="dxa"/>
+              <w:bottom w:w="70" w:type="dxa"/>
+              <w:left w:w="40" w:type="dxa"/>
+              <w:right w:w="40" w:type="dxa"/>
+            </w:tcMar>
+          </w:tcPr>
+          <w:p/>
+        </w:tc>
+        <w:tc>
+          <w:tcPr>
+            <w:tcW w:type="dxa" w:w="1586"/>
+            <w:shd w:fill="FAF8F2"/>
+            <w:tcMar>
+              <w:top w:w="70" w:type="dxa"/>
+              <w:bottom w:w="70" w:type="dxa"/>
+              <w:left w:w="40" w:type="dxa"/>
+              <w:right w:w="40" w:type="dxa"/>
+            </w:tcMar>
+          </w:tcPr>
+          <w:p/>
+        </w:tc>
+        <w:tc>
+          <w:tcPr>
+            <w:tcW w:type="dxa" w:w="1586"/>
+            <w:shd w:fill="FAF8F2"/>
+            <w:tcMar>
+              <w:top w:w="70" w:type="dxa"/>
+              <w:bottom w:w="70" w:type="dxa"/>
+              <w:left w:w="40" w:type="dxa"/>
+              <w:right w:w="40" w:type="dxa"/>
+            </w:tcMar>
+          </w:tcPr>
+          <w:p/>
+        </w:tc>
+        <w:tc>
+          <w:tcPr>
+            <w:tcW w:type="dxa" w:w="1586"/>
+            <w:shd w:fill="FAF8F2"/>
+            <w:tcMar>
+              <w:top w:w="70" w:type="dxa"/>
+              <w:bottom w:w="70" w:type="dxa"/>
+              <w:left w:w="40" w:type="dxa"/>
+              <w:right w:w="40" w:type="dxa"/>
+            </w:tcMar>
+          </w:tcPr>
+          <w:p/>
+        </w:tc>
+      </w:tr>
+      <w:tr>
+        <w:tc>
+          <w:tcPr>
+            <w:tcW w:type="dxa" w:w="1586"/>
+            <w:shd w:fill="FFFDF5"/>
+            <w:tcMar>
+              <w:top w:w="70" w:type="dxa"/>
+              <w:bottom w:w="70" w:type="dxa"/>
+              <w:left w:w="40" w:type="dxa"/>
+              <w:right w:w="40" w:type="dxa"/>
+            </w:tcMar>
+          </w:tcPr>
+          <w:p>
+            <w:r>
+              <w:rPr>
+                <w:rFonts w:ascii="PingFang TC" w:hAnsi="PingFang TC"/>
+                <w:b/>
+                <w:color w:val="B8860B"/>
+                <w:sz w:val="19"/>
+              </w:rPr>
+              <w:t>龍社路 601 號</w:t>
+            </w:r>
+          </w:p>
+        </w:tc>
+        <w:tc>
+          <w:tcPr>
+            <w:tcW w:type="dxa" w:w="1586"/>
+            <w:shd w:fill="FFFFFF"/>
+            <w:tcMar>
+              <w:top w:w="70" w:type="dxa"/>
+              <w:bottom w:w="70" w:type="dxa"/>
+              <w:left w:w="40" w:type="dxa"/>
+              <w:right w:w="40" w:type="dxa"/>
+            </w:tcMar>
+          </w:tcPr>
+          <w:p/>
+        </w:tc>
+        <w:tc>
+          <w:tcPr>
+            <w:tcW w:type="dxa" w:w="1586"/>
+            <w:shd w:fill="FFFFFF"/>
+            <w:tcMar>
+              <w:top w:w="70" w:type="dxa"/>
+              <w:bottom w:w="70" w:type="dxa"/>
+              <w:left w:w="40" w:type="dxa"/>
+              <w:right w:w="40" w:type="dxa"/>
+            </w:tcMar>
+          </w:tcPr>
+          <w:p/>
+        </w:tc>
+        <w:tc>
+          <w:tcPr>
+            <w:tcW w:type="dxa" w:w="1586"/>
+            <w:shd w:fill="FFFFFF"/>
+            <w:tcMar>
+              <w:top w:w="70" w:type="dxa"/>
+              <w:bottom w:w="70" w:type="dxa"/>
+              <w:left w:w="40" w:type="dxa"/>
+              <w:right w:w="40" w:type="dxa"/>
+            </w:tcMar>
+          </w:tcPr>
+          <w:p/>
+        </w:tc>
+        <w:tc>
+          <w:tcPr>
+            <w:tcW w:type="dxa" w:w="1586"/>
+            <w:shd w:fill="FFFFFF"/>
+            <w:tcMar>
+              <w:top w:w="70" w:type="dxa"/>
+              <w:bottom w:w="70" w:type="dxa"/>
+              <w:left w:w="40" w:type="dxa"/>
+              <w:right w:w="40" w:type="dxa"/>
+            </w:tcMar>
+          </w:tcPr>
+          <w:p/>
+        </w:tc>
+        <w:tc>
+          <w:tcPr>
+            <w:tcW w:type="dxa" w:w="1586"/>
+            <w:shd w:fill="FFFFFF"/>
+            <w:tcMar>
+              <w:top w:w="70" w:type="dxa"/>
+              <w:bottom w:w="70" w:type="dxa"/>
+              <w:left w:w="40" w:type="dxa"/>
+              <w:right w:w="40" w:type="dxa"/>
+            </w:tcMar>
+          </w:tcPr>
+          <w:p/>
+        </w:tc>
+      </w:tr>
+      <w:tr>
+        <w:tc>
+          <w:tcPr>
+            <w:tcW w:type="dxa" w:w="1586"/>
+            <w:shd w:fill="FFFDF5"/>
+            <w:tcMar>
+              <w:top w:w="70" w:type="dxa"/>
+              <w:bottom w:w="70" w:type="dxa"/>
+              <w:left w:w="40" w:type="dxa"/>
+              <w:right w:w="40" w:type="dxa"/>
+            </w:tcMar>
+          </w:tcPr>
+          <w:p>
+            <w:r>
+              <w:rPr>
+                <w:rFonts w:ascii="PingFang TC" w:hAnsi="PingFang TC"/>
+                <w:b/>
+                <w:color w:val="B8860B"/>
+                <w:sz w:val="19"/>
+              </w:rPr>
+              <w:t>龍社路 603 號</w:t>
+            </w:r>
+          </w:p>
+        </w:tc>
+        <w:tc>
+          <w:tcPr>
+            <w:tcW w:type="dxa" w:w="1586"/>
+            <w:shd w:fill="FAF8F2"/>
+            <w:tcMar>
+              <w:top w:w="70" w:type="dxa"/>
+              <w:bottom w:w="70" w:type="dxa"/>
+              <w:left w:w="40" w:type="dxa"/>
+              <w:right w:w="40" w:type="dxa"/>
+            </w:tcMar>
+          </w:tcPr>
+          <w:p/>
+        </w:tc>
+        <w:tc>
+          <w:tcPr>
+            <w:tcW w:type="dxa" w:w="1586"/>
+            <w:shd w:fill="FAF8F2"/>
+            <w:tcMar>
+              <w:top w:w="70" w:type="dxa"/>
+              <w:bottom w:w="70" w:type="dxa"/>
+              <w:left w:w="40" w:type="dxa"/>
+              <w:right w:w="40" w:type="dxa"/>
+            </w:tcMar>
+          </w:tcPr>
+          <w:p/>
+        </w:tc>
+        <w:tc>
+          <w:tcPr>
+            <w:tcW w:type="dxa" w:w="1586"/>
+            <w:shd w:fill="FAF8F2"/>
+            <w:tcMar>
+              <w:top w:w="70" w:type="dxa"/>
+              <w:bottom w:w="70" w:type="dxa"/>
+              <w:left w:w="40" w:type="dxa"/>
+              <w:right w:w="40" w:type="dxa"/>
+            </w:tcMar>
+          </w:tcPr>
+          <w:p/>
+        </w:tc>
+        <w:tc>
+          <w:tcPr>
+            <w:tcW w:type="dxa" w:w="1586"/>
+            <w:shd w:fill="FAF8F2"/>
+            <w:tcMar>
+              <w:top w:w="70" w:type="dxa"/>
+              <w:bottom w:w="70" w:type="dxa"/>
+              <w:left w:w="40" w:type="dxa"/>
+              <w:right w:w="40" w:type="dxa"/>
+            </w:tcMar>
+          </w:tcPr>
+          <w:p/>
+        </w:tc>
+        <w:tc>
+          <w:tcPr>
+            <w:tcW w:type="dxa" w:w="1586"/>
+            <w:shd w:fill="FAF8F2"/>
+            <w:tcMar>
+              <w:top w:w="70" w:type="dxa"/>
+              <w:bottom w:w="70" w:type="dxa"/>
+              <w:left w:w="40" w:type="dxa"/>
+              <w:right w:w="40" w:type="dxa"/>
+            </w:tcMar>
+          </w:tcPr>
+          <w:p/>
+        </w:tc>
+      </w:tr>
+    </w:tbl>
+    <w:p>
+      <w:pPr>
+        <w:spacing w:before="160" w:after="40"/>
+      </w:pPr>
+      <w:r>
+        <w:rPr>
+          <w:rFonts w:ascii="PingFang TC" w:hAnsi="PingFang TC"/>
+          <w:b/>
+          <w:color w:val="B8860B"/>
+          <w:sz w:val="23"/>
+        </w:rPr>
+        <w:t>【檢附法定證物清冊】</w:t>
+      </w:r>
+    </w:p>
+    <w:p>
+      <w:pPr>
+        <w:spacing w:line="300" w:lineRule="auto" w:after="40"/>
+      </w:pPr>
+      <w:r>
+        <w:rPr>
+          <w:rFonts w:ascii="PingFang TC" w:hAnsi="PingFang TC"/>
+          <w:b/>
+          <w:color w:val="B8860B"/>
+          <w:sz w:val="19"/>
+        </w:rPr>
+        <w:t xml:space="preserve">• 證物一：地籍圖謄本與龍社路公有計畫道路證明 </w:t>
+      </w:r>
+      <w:r>
+        <w:rPr>
+          <w:rFonts w:ascii="PingFang TC" w:hAnsi="PingFang TC"/>
+          <w:color w:val="22252A"/>
+          <w:sz w:val="19"/>
+        </w:rPr>
+        <w:t>（官方地籍謄本，證明 A2 區坐落地號緊臨公有計畫道路龍社路，出入完全獨立，無通行私設巷道）。</w:t>
+      </w:r>
+    </w:p>
+    <w:p>
+      <w:pPr>
+        <w:spacing w:line="300" w:lineRule="auto" w:after="40"/>
+      </w:pPr>
+      <w:r>
+        <w:rPr>
+          <w:rFonts w:ascii="PingFang TC" w:hAnsi="PingFang TC"/>
+          <w:b/>
+          <w:color w:val="B8860B"/>
+          <w:sz w:val="19"/>
+        </w:rPr>
+        <w:t xml:space="preserve">• 證物二：富宇大地 115 年 5 月例會議決紀錄及 9 月財務月報表 </w:t>
+      </w:r>
+      <w:r>
+        <w:rPr>
+          <w:rFonts w:ascii="PingFang TC" w:hAnsi="PingFang TC"/>
+          <w:color w:val="22252A"/>
+          <w:sz w:val="19"/>
+        </w:rPr>
+        <w:t>（官方會議紀錄與財報，客觀證實新光銀行「A2 大境定存單 NT$ 220,231 元」專單保管與交屋基金 6 萬元之事實）。</w:t>
+      </w:r>
+    </w:p>
+    <w:p>
+      <w:pPr>
+        <w:spacing w:line="300" w:lineRule="auto" w:after="40"/>
+      </w:pPr>
+      <w:r>
+        <w:rPr>
+          <w:rFonts w:ascii="PingFang TC" w:hAnsi="PingFang TC"/>
+          <w:b/>
+          <w:color w:val="B8860B"/>
+          <w:sz w:val="19"/>
+        </w:rPr>
+        <w:t xml:space="preserve">• 證物三：自來水與電力獨立戶號清冊及排污自主證明 </w:t>
+      </w:r>
+      <w:r>
+        <w:rPr>
+          <w:rFonts w:ascii="PingFang TC" w:hAnsi="PingFang TC"/>
+          <w:color w:val="22252A"/>
+          <w:sz w:val="19"/>
+        </w:rPr>
+        <w:t>（各戶台水水號、台電電號直供證明，證實水電排污完全自主獨立，無共有不可分性）。</w:t>
+      </w:r>
+    </w:p>
+    <w:p>
+      <w:pPr>
+        <w:spacing w:line="300" w:lineRule="auto" w:after="40"/>
+      </w:pPr>
+      <w:r>
+        <w:rPr>
+          <w:rFonts w:ascii="PingFang TC" w:hAnsi="PingFang TC"/>
+          <w:b/>
+          <w:color w:val="B8860B"/>
+          <w:sz w:val="19"/>
+        </w:rPr>
+        <w:t xml:space="preserve">• 證物四：生活廢棄物自行清運切結承諾書 </w:t>
+      </w:r>
+      <w:r>
+        <w:rPr>
+          <w:rFonts w:ascii="PingFang TC" w:hAnsi="PingFang TC"/>
+          <w:color w:val="22252A"/>
+          <w:sz w:val="19"/>
+        </w:rPr>
+        <w:t>（全體 6 戶切結放棄大社區內部收費子母車，生活垃圾門前等候免費公有清潔隊清運）。</w:t>
+      </w:r>
+    </w:p>
+    <w:p>
+      <w:pPr>
+        <w:spacing w:line="300" w:lineRule="auto" w:after="40"/>
+      </w:pPr>
+      <w:r>
+        <w:rPr>
+          <w:rFonts w:ascii="PingFang TC" w:hAnsi="PingFang TC"/>
+          <w:b/>
+          <w:color w:val="B8860B"/>
+          <w:sz w:val="19"/>
+        </w:rPr>
+        <w:t xml:space="preserve">• 證物五：A2 區 6 戶建物第一類登記謄本清冊 </w:t>
+      </w:r>
+      <w:r>
+        <w:rPr>
+          <w:rFonts w:ascii="PingFang TC" w:hAnsi="PingFang TC"/>
+          <w:color w:val="22252A"/>
+          <w:sz w:val="19"/>
+        </w:rPr>
+        <w:t>（證明申請人等 6 戶為合法區分所有權人之物權資格證明）。</w:t>
+      </w:r>
+    </w:p>
+    <w:p>
+      <w:pPr>
+        <w:spacing w:before="160"/>
       </w:pPr>
       <w:r>
         <w:rPr>
           <w:rFonts w:ascii="PingFang TC" w:hAnsi="PingFang TC"/>
           <w:b/>
           <w:color w:val="1A1D20"/>
-          <w:sz w:val="17"/>
+          <w:sz w:val="22"/>
         </w:rPr>
         <w:t>謹  呈</w:t>
         <w:br/>
@@ -1277,16 +1190,16 @@
           <w:rFonts w:ascii="PingFang TC" w:hAnsi="PingFang TC"/>
           <w:b/>
           <w:color w:val="B8860B"/>
-          <w:sz w:val="16"/>
+          <w:sz w:val="21"/>
         </w:rPr>
-        <w:t>申請人代表兼特別代理人：廖倫豪（簽章）                      中華民國 115 年 _____ 月 _____ 日</w:t>
+        <w:t>申請人代表兼特別代理人：廖倫豪 博士（簽章）              中華民國 115 年 _____ 月 _____ 日</w:t>
       </w:r>
     </w:p>
     <w:sectPr>
       <w:headerReference w:type="default" r:id="rId9"/>
       <w:footerReference w:type="default" r:id="rId10"/>
-      <w:pgSz w:w="11906" w:h="16838"/>
-      <w:pgMar w:top="794" w:right="1020" w:bottom="794" w:left="1020" w:header="720" w:footer="720" w:gutter="0"/>
+      <w:pgSz w:w="12240" w:h="15840"/>
+      <w:pgMar w:top="1247" w:right="1361" w:bottom="1247" w:left="1361" w:header="720" w:footer="720" w:gutter="0"/>
       <w:cols w:space="720"/>
       <w:docGrid w:linePitch="360"/>
     </w:sectPr>
@@ -1304,46 +1217,10 @@
     <w:r>
       <w:rPr>
         <w:rFonts w:ascii="PingFang TC" w:hAnsi="PingFang TC"/>
-        <w:color w:val="8C8273"/>
+        <w:color w:val="787369"/>
         <w:sz w:val="17"/>
       </w:rPr>
-      <w:t xml:space="preserve">報告人：廖倫豪  ｜  第 </w:t>
-    </w:r>
-    <w:fldSimple w:instr="PAGE">
-      <w:r>
-        <w:rPr>
-          <w:rFonts w:ascii="PingFang TC" w:eastAsia="PingFang TC"/>
-          <w:sz w:val="17"/>
-          <w:color w:val="8C8273"/>
-        </w:rPr>
-        <w:t>1</w:t>
-      </w:r>
-    </w:fldSimple>
-    <w:r>
-      <w:rPr>
-        <w:rFonts w:ascii="PingFang TC" w:hAnsi="PingFang TC"/>
-        <w:color w:val="8C8273"/>
-        <w:sz w:val="17"/>
-      </w:rPr>
-      <w:t xml:space="preserve"> 頁  /  共 </w:t>
-    </w:r>
-    <w:fldSimple w:instr="NUMPAGES">
-      <w:r>
-        <w:rPr>
-          <w:rFonts w:ascii="PingFang TC" w:eastAsia="PingFang TC"/>
-          <w:sz w:val="17"/>
-          <w:color w:val="8C8273"/>
-        </w:rPr>
-        <w:t>2</w:t>
-      </w:r>
-    </w:fldSimple>
-    <w:r>
-      <w:rPr>
-        <w:rFonts w:ascii="PingFang TC" w:hAnsi="PingFang TC"/>
-        <w:color w:val="8C8273"/>
-        <w:sz w:val="17"/>
-      </w:rPr>
-      <w:t xml:space="preserve"> 頁</w:t>
+      <w:t>研究主持／報告人：廖倫豪 博士（Howard Liao Ph.D.）</w:t>
     </w:r>
   </w:p>
 </w:ftr>
@@ -1359,10 +1236,10 @@
     <w:r>
       <w:rPr>
         <w:rFonts w:ascii="PingFang TC" w:hAnsi="PingFang TC"/>
-        <w:color w:val="8C8273"/>
-        <w:sz w:val="16"/>
-      </w:rPr>
-      <w:t>臺中市政府公寓大廈爭議事件調處申請書 ｜ 專案編號：FY-SPLIT-2026-A2 ｜ 專案編號：FY-SPLIT-2026-A2</w:t>
+        <w:color w:val="787369"/>
+        <w:sz w:val="17"/>
+      </w:rPr>
+      <w:t>臺中市政府公寓大廈爭議事件調處申請書 ｜ 專案編號：FY-SPLIT-2026-A2</w:t>
     </w:r>
   </w:p>
 </w:hdr>

</xml_diff>